<commit_message>
fix(v2): el bloque Transferencia de la calculadora se puede usar desde la interfaz
Se ocultaba entero con tamano 0, pero el campo del tamano vive dentro:
nadie podia activarlo. Ahora se muestra en cuanto hay camino valido y con
tamano 0 solo queda vacia la lista de pasos. El manual se regenera con el
bloque tal como se ve ahora y sin la nota del desvio; el checklist de humo
de la calculadora describe el comportamiento nuevo.

Co-Authored-By: Claude Opus 5 (1M context) <noreply@anthropic.com>
Claude-Session: https://claude.ai/code/session_01UiLMZsa2gtTdjhwmJa115f
</commit_message>
<xml_diff>
--- a/Manual_de_usuario_Simulador_Stop_and_Wait.docx
+++ b/Manual_de_usuario_Simulador_Stop_and_Wait.docx
@@ -7452,7 +7452,7 @@
       <w:r>
         <w:drawing>
           <wp:inline xmlns:a="http://schemas.openxmlformats.org/drawingml/2006/main" xmlns:pic="http://schemas.openxmlformats.org/drawingml/2006/picture">
-            <wp:extent cx="5976000" cy="7739034"/>
+            <wp:extent cx="5626347" cy="8100000"/>
             <wp:docPr id="15" name="Picture 15"/>
             <wp:cNvGraphicFramePr>
               <a:graphicFrameLocks noChangeAspect="1"/>
@@ -7473,7 +7473,7 @@
                   <pic:spPr>
                     <a:xfrm>
                       <a:off x="0" y="0"/>
-                      <a:ext cx="5976000" cy="7739034"/>
+                      <a:ext cx="5626347" cy="8100000"/>
                     </a:xfrm>
                     <a:prstGeom prst="rect"/>
                   </pic:spPr>
@@ -10771,8 +10771,253 @@
       <w:r>
         <w:drawing>
           <wp:inline xmlns:a="http://schemas.openxmlformats.org/drawingml/2006/main" xmlns:pic="http://schemas.openxmlformats.org/drawingml/2006/picture">
+            <wp:extent cx="5976000" cy="1147291"/>
+            <wp:docPr id="23" name="Picture 23"/>
+            <wp:cNvGraphicFramePr>
+              <a:graphicFrameLocks noChangeAspect="1"/>
+            </wp:cNvGraphicFramePr>
+            <a:graphic>
+              <a:graphicData uri="http://schemas.openxmlformats.org/drawingml/2006/picture">
+                <pic:pic>
+                  <pic:nvPicPr>
+                    <pic:cNvPr id="0" name="B09-transferencia-vacio.png"/>
+                    <pic:cNvPicPr/>
+                  </pic:nvPicPr>
+                  <pic:blipFill>
+                    <a:blip r:embed="rId31"/>
+                    <a:stretch>
+                      <a:fillRect/>
+                    </a:stretch>
+                  </pic:blipFill>
+                  <pic:spPr>
+                    <a:xfrm>
+                      <a:off x="0" y="0"/>
+                      <a:ext cx="5976000" cy="1147291"/>
+                    </a:xfrm>
+                    <a:prstGeom prst="rect"/>
+                  </pic:spPr>
+                </pic:pic>
+              </a:graphicData>
+            </a:graphic>
+          </wp:inline>
+        </w:drawing>
+      </w:r>
+    </w:p>
+    <w:p>
+      <w:pPr>
+        <w:spacing w:after="200"/>
+        <w:jc w:val="center"/>
+      </w:pPr>
+      <w:r>
+        <w:rPr>
+          <w:b/>
+          <w:color w:val="5A5A5A"/>
+          <w:sz w:val="19"/>
+        </w:rPr>
+        <w:t xml:space="preserve">Figura 23. </w:t>
+      </w:r>
+      <w:r>
+        <w:rPr>
+          <w:color w:val="5A5A5A"/>
+          <w:sz w:val="19"/>
+        </w:rPr>
+        <w:t>Bloque Transferencia recién abierta la calculadora: solo los dos campos.</w:t>
+      </w:r>
+    </w:p>
+    <w:tbl>
+      <w:tblPr>
+        <w:tblStyle w:val="TableGrid"/>
+        <w:tblW w:type="auto" w:w="0"/>
+        <w:jc w:val="center"/>
+        <w:tblLayout w:type="fixed"/>
+        <w:tblLook w:firstColumn="1" w:firstRow="1" w:lastColumn="0" w:lastRow="0" w:noHBand="0" w:noVBand="1" w:val="04A0"/>
+      </w:tblPr>
+      <w:tblGrid>
+        <w:gridCol w:w="624"/>
+        <w:gridCol w:w="2381"/>
+        <w:gridCol w:w="6406"/>
+      </w:tblGrid>
+      <w:tr>
+        <w:tc>
+          <w:tcPr>
+            <w:tcW w:type="dxa" w:w="624"/>
+            <w:shd w:val="clear" w:color="auto" w:fill="F2F2F2"/>
+          </w:tcPr>
+          <w:p>
+            <w:r/>
+            <w:r>
+              <w:rPr>
+                <w:b/>
+                <w:sz w:val="20"/>
+              </w:rPr>
+              <w:t>N.º</w:t>
+            </w:r>
+          </w:p>
+        </w:tc>
+        <w:tc>
+          <w:tcPr>
+            <w:tcW w:type="dxa" w:w="2381"/>
+            <w:shd w:val="clear" w:color="auto" w:fill="F2F2F2"/>
+          </w:tcPr>
+          <w:p>
+            <w:r/>
+            <w:r>
+              <w:rPr>
+                <w:b/>
+                <w:sz w:val="20"/>
+              </w:rPr>
+              <w:t>Elemento</w:t>
+            </w:r>
+          </w:p>
+        </w:tc>
+        <w:tc>
+          <w:tcPr>
+            <w:tcW w:type="dxa" w:w="6406"/>
+            <w:shd w:val="clear" w:color="auto" w:fill="F2F2F2"/>
+          </w:tcPr>
+          <w:p>
+            <w:r/>
+            <w:r>
+              <w:rPr>
+                <w:b/>
+                <w:sz w:val="20"/>
+              </w:rPr>
+              <w:t>Qué hace y qué afecta</w:t>
+            </w:r>
+          </w:p>
+        </w:tc>
+      </w:tr>
+      <w:tr>
+        <w:tc>
+          <w:tcPr>
+            <w:tcW w:type="dxa" w:w="624"/>
+          </w:tcPr>
+          <w:p>
+            <w:pPr>
+              <w:spacing w:after="40"/>
+              <w:jc w:val="center"/>
+            </w:pPr>
+            <w:r/>
+            <w:r>
+              <w:rPr>
+                <w:b/>
+                <w:color w:val="B2261E"/>
+                <w:sz w:val="20"/>
+              </w:rPr>
+              <w:t>1</w:t>
+            </w:r>
+          </w:p>
+        </w:tc>
+        <w:tc>
+          <w:tcPr>
+            <w:tcW w:type="dxa" w:w="2381"/>
+          </w:tcPr>
+          <w:p>
+            <w:pPr>
+              <w:spacing w:after="40"/>
+            </w:pPr>
+            <w:r/>
+            <w:r>
+              <w:rPr>
+                <w:b/>
+                <w:sz w:val="20"/>
+              </w:rPr>
+              <w:t>Tamaño total</w:t>
+            </w:r>
+          </w:p>
+        </w:tc>
+        <w:tc>
+          <w:tcPr>
+            <w:tcW w:type="dxa" w:w="6406"/>
+          </w:tcPr>
+          <w:p>
+            <w:pPr>
+              <w:spacing w:after="40"/>
+            </w:pPr>
+            <w:r/>
+            <w:r>
+              <w:rPr>
+                <w:sz w:val="20"/>
+              </w:rPr>
+              <w:t>Cuántos bits, KB o MB hay que enviar en total. Con 0 el bloque no calcula nada.</w:t>
+            </w:r>
+          </w:p>
+        </w:tc>
+      </w:tr>
+      <w:tr>
+        <w:tc>
+          <w:tcPr>
+            <w:tcW w:type="dxa" w:w="624"/>
+          </w:tcPr>
+          <w:p>
+            <w:pPr>
+              <w:spacing w:after="40"/>
+              <w:jc w:val="center"/>
+            </w:pPr>
+            <w:r/>
+            <w:r>
+              <w:rPr>
+                <w:b/>
+                <w:color w:val="B2261E"/>
+                <w:sz w:val="20"/>
+              </w:rPr>
+              <w:t>2</w:t>
+            </w:r>
+          </w:p>
+        </w:tc>
+        <w:tc>
+          <w:tcPr>
+            <w:tcW w:type="dxa" w:w="2381"/>
+          </w:tcPr>
+          <w:p>
+            <w:pPr>
+              <w:spacing w:after="40"/>
+            </w:pPr>
+            <w:r/>
+            <w:r>
+              <w:rPr>
+                <w:b/>
+                <w:sz w:val="20"/>
+              </w:rPr>
+              <w:t>Unidad</w:t>
+            </w:r>
+          </w:p>
+        </w:tc>
+        <w:tc>
+          <w:tcPr>
+            <w:tcW w:type="dxa" w:w="6406"/>
+          </w:tcPr>
+          <w:p>
+            <w:pPr>
+              <w:spacing w:after="40"/>
+            </w:pPr>
+            <w:r/>
+            <w:r>
+              <w:rPr>
+                <w:sz w:val="20"/>
+              </w:rPr>
+              <w:t>bits, KB (1000 bytes) o MB (1000 KB).</w:t>
+            </w:r>
+          </w:p>
+        </w:tc>
+      </w:tr>
+    </w:tbl>
+    <w:p>
+      <w:pPr>
+        <w:spacing w:after="40"/>
+      </w:pPr>
+    </w:p>
+    <w:p>
+      <w:pPr>
+        <w:keepNext/>
+        <w:spacing w:after="40"/>
+        <w:jc w:val="center"/>
+      </w:pPr>
+      <w:r>
+        <w:drawing>
+          <wp:inline xmlns:a="http://schemas.openxmlformats.org/drawingml/2006/main" xmlns:pic="http://schemas.openxmlformats.org/drawingml/2006/picture">
             <wp:extent cx="5976000" cy="4267671"/>
-            <wp:docPr id="23" name="Picture 23"/>
+            <wp:docPr id="24" name="Picture 24"/>
             <wp:cNvGraphicFramePr>
               <a:graphicFrameLocks noChangeAspect="1"/>
             </wp:cNvGraphicFramePr>
@@ -10784,7 +11029,7 @@
                     <pic:cNvPicPr/>
                   </pic:nvPicPr>
                   <pic:blipFill>
-                    <a:blip r:embed="rId31"/>
+                    <a:blip r:embed="rId32"/>
                     <a:stretch>
                       <a:fillRect/>
                     </a:stretch>
@@ -10814,7 +11059,7 @@
           <w:color w:val="5A5A5A"/>
           <w:sz w:val="19"/>
         </w:rPr>
-        <w:t xml:space="preserve">Figura 23. </w:t>
+        <w:t xml:space="preserve">Figura 24. </w:t>
       </w:r>
       <w:r>
         <w:rPr>
@@ -10939,7 +11184,7 @@
               <w:rPr>
                 <w:sz w:val="20"/>
               </w:rPr>
-              <w:t>Cuántos bits, KB o MB hay que enviar en total.</w:t>
+              <w:t>Al escribir un valor mayor que 0 aparecen los pasos.</w:t>
             </w:r>
           </w:p>
         </w:tc>
@@ -10996,7 +11241,7 @@
               <w:rPr>
                 <w:sz w:val="20"/>
               </w:rPr>
-              <w:t>bits, KB (1000 bytes) o MB (1000 KB).</w:t>
+              <w:t>Cambiarla recalcula al instante.</w:t>
             </w:r>
           </w:p>
         </w:tc>
@@ -11054,60 +11299,6 @@
                 <w:sz w:val="20"/>
               </w:rPr>
               <w:t>Tramas necesarias ⌈bits / L⌉, tiempo total = tramas × ciclo, y el caudal conseguido = bits / tiempo (que coincide con el caudal útil del resultado).</w:t>
-            </w:r>
-          </w:p>
-        </w:tc>
-      </w:tr>
-    </w:tbl>
-    <w:p>
-      <w:pPr>
-        <w:spacing w:after="40"/>
-      </w:pPr>
-    </w:p>
-    <w:tbl>
-      <w:tblPr>
-        <w:tblW w:type="auto" w:w="0"/>
-        <w:jc w:val="center"/>
-        <w:tblLook w:firstColumn="1" w:firstRow="1" w:lastColumn="0" w:lastRow="0" w:noHBand="0" w:noVBand="1" w:val="04A0"/>
-      </w:tblPr>
-      <w:tblGrid>
-        <w:gridCol w:w="9412"/>
-      </w:tblGrid>
-      <w:tr>
-        <w:tc>
-          <w:tcPr>
-            <w:tcW w:type="dxa" w:w="9411"/>
-            <w:shd w:val="clear" w:color="auto" w:fill="FBECEB"/>
-            <w:tcBorders>
-              <w:top w:val="nil"/>
-              <w:left w:val="single" w:sz="24" w:color="B2261E"/>
-              <w:bottom w:val="nil"/>
-              <w:right w:val="nil"/>
-            </w:tcBorders>
-          </w:tcPr>
-          <w:p>
-            <w:pPr>
-              <w:spacing w:after="40"/>
-            </w:pPr>
-            <w:r/>
-            <w:r>
-              <w:rPr>
-                <w:b/>
-                <w:color w:val="B2261E"/>
-                <w:sz w:val="18"/>
-              </w:rPr>
-              <w:t>ESTE BLOQUE NO SE PUEDE ACTIVAR DESDE LA INTERFAZ EN LA VERSIÓN ACTUAL</w:t>
-            </w:r>
-          </w:p>
-          <w:p>
-            <w:pPr>
-              <w:spacing w:after="40"/>
-            </w:pPr>
-            <w:r>
-              <w:rPr>
-                <w:sz w:val="20"/>
-              </w:rPr>
-              <w:t>El bloque Transferencia solo aparece cuando el tamaño es mayor que 0, pero el campo para escribir el tamaño está dentro del propio bloque. Resultado: el usuario no tiene forma de verlo. Para la figura se ha rellenado el campo desde fuera. Está anotado como corrección pendiente.</w:t>
             </w:r>
           </w:p>
         </w:tc>
@@ -11136,7 +11327,7 @@
         <w:drawing>
           <wp:inline xmlns:a="http://schemas.openxmlformats.org/drawingml/2006/main" xmlns:pic="http://schemas.openxmlformats.org/drawingml/2006/picture">
             <wp:extent cx="5976000" cy="3820101"/>
-            <wp:docPr id="24" name="Picture 24"/>
+            <wp:docPr id="25" name="Picture 25"/>
             <wp:cNvGraphicFramePr>
               <a:graphicFrameLocks noChangeAspect="1"/>
             </wp:cNvGraphicFramePr>
@@ -11148,7 +11339,7 @@
                     <pic:cNvPicPr/>
                   </pic:nvPicPr>
                   <pic:blipFill>
-                    <a:blip r:embed="rId32"/>
+                    <a:blip r:embed="rId33"/>
                     <a:stretch>
                       <a:fillRect/>
                     </a:stretch>
@@ -11178,7 +11369,7 @@
           <w:color w:val="5A5A5A"/>
           <w:sz w:val="19"/>
         </w:rPr>
-        <w:t xml:space="preserve">Figura 24. </w:t>
+        <w:t xml:space="preserve">Figura 25. </w:t>
       </w:r>
       <w:r>
         <w:rPr>
@@ -11324,7 +11515,7 @@
         <w:drawing>
           <wp:inline xmlns:a="http://schemas.openxmlformats.org/drawingml/2006/main" xmlns:pic="http://schemas.openxmlformats.org/drawingml/2006/picture">
             <wp:extent cx="5976000" cy="3788582"/>
-            <wp:docPr id="25" name="Picture 25"/>
+            <wp:docPr id="26" name="Picture 26"/>
             <wp:cNvGraphicFramePr>
               <a:graphicFrameLocks noChangeAspect="1"/>
             </wp:cNvGraphicFramePr>
@@ -11336,7 +11527,7 @@
                     <pic:cNvPicPr/>
                   </pic:nvPicPr>
                   <pic:blipFill>
-                    <a:blip r:embed="rId33"/>
+                    <a:blip r:embed="rId34"/>
                     <a:stretch>
                       <a:fillRect/>
                     </a:stretch>
@@ -11366,7 +11557,7 @@
           <w:color w:val="5A5A5A"/>
           <w:sz w:val="19"/>
         </w:rPr>
-        <w:t xml:space="preserve">Figura 25. </w:t>
+        <w:t xml:space="preserve">Figura 26. </w:t>
       </w:r>
       <w:r>
         <w:rPr>
@@ -11617,7 +11808,7 @@
         <w:drawing>
           <wp:inline xmlns:a="http://schemas.openxmlformats.org/drawingml/2006/main" xmlns:pic="http://schemas.openxmlformats.org/drawingml/2006/picture">
             <wp:extent cx="5976000" cy="4139315"/>
-            <wp:docPr id="26" name="Picture 26"/>
+            <wp:docPr id="27" name="Picture 27"/>
             <wp:cNvGraphicFramePr>
               <a:graphicFrameLocks noChangeAspect="1"/>
             </wp:cNvGraphicFramePr>
@@ -11629,7 +11820,7 @@
                     <pic:cNvPicPr/>
                   </pic:nvPicPr>
                   <pic:blipFill>
-                    <a:blip r:embed="rId34"/>
+                    <a:blip r:embed="rId35"/>
                     <a:stretch>
                       <a:fillRect/>
                     </a:stretch>
@@ -11659,7 +11850,7 @@
           <w:color w:val="5A5A5A"/>
           <w:sz w:val="19"/>
         </w:rPr>
-        <w:t xml:space="preserve">Figura 26. </w:t>
+        <w:t xml:space="preserve">Figura 27. </w:t>
       </w:r>
       <w:r>
         <w:rPr>
@@ -12179,7 +12370,7 @@
         <w:drawing>
           <wp:inline xmlns:a="http://schemas.openxmlformats.org/drawingml/2006/main" xmlns:pic="http://schemas.openxmlformats.org/drawingml/2006/picture">
             <wp:extent cx="3240000" cy="4774737"/>
-            <wp:docPr id="27" name="Picture 27"/>
+            <wp:docPr id="28" name="Picture 28"/>
             <wp:cNvGraphicFramePr>
               <a:graphicFrameLocks noChangeAspect="1"/>
             </wp:cNvGraphicFramePr>
@@ -12221,7 +12412,7 @@
           <w:color w:val="5A5A5A"/>
           <w:sz w:val="19"/>
         </w:rPr>
-        <w:t xml:space="preserve">Figura 27. </w:t>
+        <w:t xml:space="preserve">Figura 28. </w:t>
       </w:r>
       <w:r>
         <w:rPr>
@@ -12470,7 +12661,7 @@
         <w:drawing>
           <wp:inline xmlns:a="http://schemas.openxmlformats.org/drawingml/2006/main" xmlns:pic="http://schemas.openxmlformats.org/drawingml/2006/picture">
             <wp:extent cx="5976000" cy="4139315"/>
-            <wp:docPr id="28" name="Picture 28"/>
+            <wp:docPr id="29" name="Picture 29"/>
             <wp:cNvGraphicFramePr>
               <a:graphicFrameLocks noChangeAspect="1"/>
             </wp:cNvGraphicFramePr>
@@ -12482,7 +12673,7 @@
                     <pic:cNvPicPr/>
                   </pic:nvPicPr>
                   <pic:blipFill>
-                    <a:blip r:embed="rId35"/>
+                    <a:blip r:embed="rId36"/>
                     <a:stretch>
                       <a:fillRect/>
                     </a:stretch>
@@ -12512,7 +12703,7 @@
           <w:color w:val="5A5A5A"/>
           <w:sz w:val="19"/>
         </w:rPr>
-        <w:t xml:space="preserve">Figura 28. </w:t>
+        <w:t xml:space="preserve">Figura 29. </w:t>
       </w:r>
       <w:r>
         <w:rPr>
@@ -12699,7 +12890,7 @@
         <w:drawing>
           <wp:inline xmlns:a="http://schemas.openxmlformats.org/drawingml/2006/main" xmlns:pic="http://schemas.openxmlformats.org/drawingml/2006/picture">
             <wp:extent cx="5976000" cy="4139315"/>
-            <wp:docPr id="29" name="Picture 29"/>
+            <wp:docPr id="30" name="Picture 30"/>
             <wp:cNvGraphicFramePr>
               <a:graphicFrameLocks noChangeAspect="1"/>
             </wp:cNvGraphicFramePr>
@@ -12711,7 +12902,7 @@
                     <pic:cNvPicPr/>
                   </pic:nvPicPr>
                   <pic:blipFill>
-                    <a:blip r:embed="rId36"/>
+                    <a:blip r:embed="rId37"/>
                     <a:stretch>
                       <a:fillRect/>
                     </a:stretch>
@@ -12741,7 +12932,7 @@
           <w:color w:val="5A5A5A"/>
           <w:sz w:val="19"/>
         </w:rPr>
-        <w:t xml:space="preserve">Figura 29. </w:t>
+        <w:t xml:space="preserve">Figura 30. </w:t>
       </w:r>
       <w:r>
         <w:rPr>
@@ -12842,7 +13033,7 @@
         <w:drawing>
           <wp:inline xmlns:a="http://schemas.openxmlformats.org/drawingml/2006/main" xmlns:pic="http://schemas.openxmlformats.org/drawingml/2006/picture">
             <wp:extent cx="5976000" cy="4139315"/>
-            <wp:docPr id="30" name="Picture 30"/>
+            <wp:docPr id="31" name="Picture 31"/>
             <wp:cNvGraphicFramePr>
               <a:graphicFrameLocks noChangeAspect="1"/>
             </wp:cNvGraphicFramePr>
@@ -12854,7 +13045,7 @@
                     <pic:cNvPicPr/>
                   </pic:nvPicPr>
                   <pic:blipFill>
-                    <a:blip r:embed="rId37"/>
+                    <a:blip r:embed="rId38"/>
                     <a:stretch>
                       <a:fillRect/>
                     </a:stretch>
@@ -12884,7 +13075,7 @@
           <w:color w:val="5A5A5A"/>
           <w:sz w:val="19"/>
         </w:rPr>
-        <w:t xml:space="preserve">Figura 30. </w:t>
+        <w:t xml:space="preserve">Figura 31. </w:t>
       </w:r>
       <w:r>
         <w:rPr>
@@ -13004,7 +13195,7 @@
         <w:drawing>
           <wp:inline xmlns:a="http://schemas.openxmlformats.org/drawingml/2006/main" xmlns:pic="http://schemas.openxmlformats.org/drawingml/2006/picture">
             <wp:extent cx="5976000" cy="4139315"/>
-            <wp:docPr id="31" name="Picture 31"/>
+            <wp:docPr id="32" name="Picture 32"/>
             <wp:cNvGraphicFramePr>
               <a:graphicFrameLocks noChangeAspect="1"/>
             </wp:cNvGraphicFramePr>
@@ -13013,203 +13204,6 @@
                 <pic:pic>
                   <pic:nvPicPr>
                     <pic:cNvPr id="0" name="s29-diagram-retrasada-inicio.png"/>
-                    <pic:cNvPicPr/>
-                  </pic:nvPicPr>
-                  <pic:blipFill>
-                    <a:blip r:embed="rId38"/>
-                    <a:stretch>
-                      <a:fillRect/>
-                    </a:stretch>
-                  </pic:blipFill>
-                  <pic:spPr>
-                    <a:xfrm>
-                      <a:off x="0" y="0"/>
-                      <a:ext cx="5976000" cy="4139315"/>
-                    </a:xfrm>
-                    <a:prstGeom prst="rect"/>
-                  </pic:spPr>
-                </pic:pic>
-              </a:graphicData>
-            </a:graphic>
-          </wp:inline>
-        </w:drawing>
-      </w:r>
-    </w:p>
-    <w:p>
-      <w:pPr>
-        <w:spacing w:after="200"/>
-        <w:jc w:val="center"/>
-      </w:pPr>
-      <w:r>
-        <w:rPr>
-          <w:b/>
-          <w:color w:val="5A5A5A"/>
-          <w:sz w:val="19"/>
-        </w:rPr>
-        <w:t xml:space="preserve">Figura 31. </w:t>
-      </w:r>
-      <w:r>
-        <w:rPr>
-          <w:color w:val="5A5A5A"/>
-          <w:sz w:val="19"/>
-        </w:rPr>
-        <w:t>ACK1 retrasado: el emisor retransmite F0, el receptor la descarta como duplicada y el ACK viejo llega mucho después.</w:t>
-      </w:r>
-    </w:p>
-    <w:p>
-      <w:r>
-        <w:rPr>
-          <w:i w:val="0"/>
-        </w:rPr>
-        <w:t>Secuencia de sucesos: el receptor aceptó F0 a los 20 ms y envió ACK1, pero ese ACK viaja ahora muy lento. A los 45 ms expira el temporizador y el emisor retransmite F0. A los 64,8 ms el receptor recibe una F0 correcta pero con el número que ya tenía: «F0 duplicada: se descarta y se repite el ACK». Ese segundo ACK1 llega a los 74,8 ms y el emisor sigue con F1.</w:t>
-      </w:r>
-    </w:p>
-    <w:tbl>
-      <w:tblPr>
-        <w:tblW w:type="auto" w:w="0"/>
-        <w:jc w:val="center"/>
-        <w:tblLook w:firstColumn="1" w:firstRow="1" w:lastColumn="0" w:lastRow="0" w:noHBand="0" w:noVBand="1" w:val="04A0"/>
-      </w:tblPr>
-      <w:tblGrid>
-        <w:gridCol w:w="9412"/>
-      </w:tblGrid>
-      <w:tr>
-        <w:tc>
-          <w:tcPr>
-            <w:tcW w:type="dxa" w:w="9411"/>
-            <w:shd w:val="clear" w:color="auto" w:fill="FBECEB"/>
-            <w:tcBorders>
-              <w:top w:val="nil"/>
-              <w:left w:val="single" w:sz="24" w:color="B2261E"/>
-              <w:bottom w:val="nil"/>
-              <w:right w:val="nil"/>
-            </w:tcBorders>
-          </w:tcPr>
-          <w:p>
-            <w:pPr>
-              <w:spacing w:after="40"/>
-            </w:pPr>
-            <w:r/>
-            <w:r>
-              <w:rPr>
-                <w:b/>
-                <w:color w:val="B2261E"/>
-                <w:sz w:val="18"/>
-              </w:rPr>
-              <w:t>LO QUE ENSEÑA ESTE EJERCICIO SOBRE EL BIT DE SECUENCIA</w:t>
-            </w:r>
-          </w:p>
-          <w:p>
-            <w:pPr>
-              <w:spacing w:after="40"/>
-            </w:pPr>
-            <w:r>
-              <w:rPr>
-                <w:sz w:val="20"/>
-              </w:rPr>
-              <w:t>Con un solo bit, la confirmación no dice a qué trama confirma: solo dice «mándame la 0» o «mándame la 1». Si el ACK viejo tarda más de un ciclo entero, puede llegar cuando el emisor está esperando otro ACK con el mismo número y darse por buena una trama que aún no ha llegado. En esta ejecución ocurre exactamente eso al final: el ACK1 retrasado aterriza a los 105,5 ms, justo cuando el emisor acaba de enviar la trama #3 (seq 0) y espera precisamente un ACK1; la da por confirmada y termina, y Telemetría muestra «Tramas entregadas 2 / 3». Es una limitación real del protocolo con retardos muy variables, no un fallo del simulador: por eso los protocolos reales usan números de secuencia más largos o acotan el tiempo de vida de las tramas.</w:t>
-            </w:r>
-          </w:p>
-        </w:tc>
-      </w:tr>
-    </w:tbl>
-    <w:p>
-      <w:pPr>
-        <w:spacing w:after="40"/>
-      </w:pPr>
-    </w:p>
-    <w:p>
-      <w:pPr>
-        <w:pStyle w:val="Heading2"/>
-      </w:pPr>
-      <w:r>
-        <w:t>2.8 Forzar el número de secuencia</w:t>
-      </w:r>
-    </w:p>
-    <w:tbl>
-      <w:tblPr>
-        <w:tblW w:type="auto" w:w="0"/>
-        <w:jc w:val="center"/>
-        <w:tblLook w:firstColumn="1" w:firstRow="1" w:lastColumn="0" w:lastRow="0" w:noHBand="0" w:noVBand="1" w:val="04A0"/>
-      </w:tblPr>
-      <w:tblGrid>
-        <w:gridCol w:w="9412"/>
-      </w:tblGrid>
-      <w:tr>
-        <w:tc>
-          <w:tcPr>
-            <w:tcW w:type="dxa" w:w="9411"/>
-            <w:shd w:val="clear" w:color="auto" w:fill="EAF1FB"/>
-            <w:tcBorders>
-              <w:top w:val="nil"/>
-              <w:left w:val="single" w:sz="24" w:color="2F5D9E"/>
-              <w:bottom w:val="nil"/>
-              <w:right w:val="nil"/>
-            </w:tcBorders>
-          </w:tcPr>
-          <w:p>
-            <w:pPr>
-              <w:spacing w:after="40"/>
-            </w:pPr>
-            <w:r/>
-            <w:r>
-              <w:rPr>
-                <w:b/>
-                <w:color w:val="2F5D9E"/>
-                <w:sz w:val="18"/>
-              </w:rPr>
-              <w:t>EJERCICIO</w:t>
-            </w:r>
-          </w:p>
-          <w:p>
-            <w:pPr>
-              <w:spacing w:after="40"/>
-            </w:pPr>
-            <w:r>
-              <w:rPr>
-                <w:sz w:val="20"/>
-              </w:rPr>
-              <w:t>1. Reiniciar. Iniciar a 1× y pausar cuando la segunda trama (F1) esté en el canal, pasados los 30 ms.</w:t>
-            </w:r>
-          </w:p>
-          <w:p>
-            <w:pPr>
-              <w:spacing w:after="40"/>
-            </w:pPr>
-            <w:r>
-              <w:rPr>
-                <w:sz w:val="20"/>
-              </w:rPr>
-              <w:t>2. Pulsar Forzar seq 0. Continuar.</w:t>
-            </w:r>
-          </w:p>
-        </w:tc>
-      </w:tr>
-    </w:tbl>
-    <w:p>
-      <w:pPr>
-        <w:spacing w:after="40"/>
-      </w:pPr>
-    </w:p>
-    <w:p>
-      <w:pPr>
-        <w:keepNext/>
-        <w:spacing w:after="40"/>
-        <w:jc w:val="center"/>
-      </w:pPr>
-      <w:r>
-        <w:drawing>
-          <wp:inline xmlns:a="http://schemas.openxmlformats.org/drawingml/2006/main" xmlns:pic="http://schemas.openxmlformats.org/drawingml/2006/picture">
-            <wp:extent cx="5976000" cy="4139315"/>
-            <wp:docPr id="32" name="Picture 32"/>
-            <wp:cNvGraphicFramePr>
-              <a:graphicFrameLocks noChangeAspect="1"/>
-            </wp:cNvGraphicFramePr>
-            <a:graphic>
-              <a:graphicData uri="http://schemas.openxmlformats.org/drawingml/2006/picture">
-                <pic:pic>
-                  <pic:nvPicPr>
-                    <pic:cNvPr id="0" name="s30-diagram-duplicada-inicio.png"/>
                     <pic:cNvPicPr/>
                   </pic:nvPicPr>
                   <pic:blipFill>
@@ -13244,6 +13238,203 @@
           <w:sz w:val="19"/>
         </w:rPr>
         <w:t xml:space="preserve">Figura 32. </w:t>
+      </w:r>
+      <w:r>
+        <w:rPr>
+          <w:color w:val="5A5A5A"/>
+          <w:sz w:val="19"/>
+        </w:rPr>
+        <w:t>ACK1 retrasado: el emisor retransmite F0, el receptor la descarta como duplicada y el ACK viejo llega mucho después.</w:t>
+      </w:r>
+    </w:p>
+    <w:p>
+      <w:r>
+        <w:rPr>
+          <w:i w:val="0"/>
+        </w:rPr>
+        <w:t>Secuencia de sucesos: el receptor aceptó F0 a los 20 ms y envió ACK1, pero ese ACK viaja ahora muy lento. A los 45 ms expira el temporizador y el emisor retransmite F0. A los 64,8 ms el receptor recibe una F0 correcta pero con el número que ya tenía: «F0 duplicada: se descarta y se repite el ACK». Ese segundo ACK1 llega a los 74,8 ms y el emisor sigue con F1.</w:t>
+      </w:r>
+    </w:p>
+    <w:tbl>
+      <w:tblPr>
+        <w:tblW w:type="auto" w:w="0"/>
+        <w:jc w:val="center"/>
+        <w:tblLook w:firstColumn="1" w:firstRow="1" w:lastColumn="0" w:lastRow="0" w:noHBand="0" w:noVBand="1" w:val="04A0"/>
+      </w:tblPr>
+      <w:tblGrid>
+        <w:gridCol w:w="9412"/>
+      </w:tblGrid>
+      <w:tr>
+        <w:tc>
+          <w:tcPr>
+            <w:tcW w:type="dxa" w:w="9411"/>
+            <w:shd w:val="clear" w:color="auto" w:fill="FBECEB"/>
+            <w:tcBorders>
+              <w:top w:val="nil"/>
+              <w:left w:val="single" w:sz="24" w:color="B2261E"/>
+              <w:bottom w:val="nil"/>
+              <w:right w:val="nil"/>
+            </w:tcBorders>
+          </w:tcPr>
+          <w:p>
+            <w:pPr>
+              <w:spacing w:after="40"/>
+            </w:pPr>
+            <w:r/>
+            <w:r>
+              <w:rPr>
+                <w:b/>
+                <w:color w:val="B2261E"/>
+                <w:sz w:val="18"/>
+              </w:rPr>
+              <w:t>LO QUE ENSEÑA ESTE EJERCICIO SOBRE EL BIT DE SECUENCIA</w:t>
+            </w:r>
+          </w:p>
+          <w:p>
+            <w:pPr>
+              <w:spacing w:after="40"/>
+            </w:pPr>
+            <w:r>
+              <w:rPr>
+                <w:sz w:val="20"/>
+              </w:rPr>
+              <w:t>Con un solo bit, la confirmación no dice a qué trama confirma: solo dice «mándame la 0» o «mándame la 1». Si el ACK viejo tarda más de un ciclo entero, puede llegar cuando el emisor está esperando otro ACK con el mismo número y darse por buena una trama que aún no ha llegado. En esta ejecución ocurre exactamente eso al final: el ACK1 retrasado aterriza a los 105,5 ms, justo cuando el emisor acaba de enviar la trama #3 (seq 0) y espera precisamente un ACK1; la da por confirmada y termina, y Telemetría muestra «Tramas entregadas 2 / 3». Es una limitación real del protocolo con retardos muy variables, no un fallo del simulador: por eso los protocolos reales usan números de secuencia más largos o acotan el tiempo de vida de las tramas.</w:t>
+            </w:r>
+          </w:p>
+        </w:tc>
+      </w:tr>
+    </w:tbl>
+    <w:p>
+      <w:pPr>
+        <w:spacing w:after="40"/>
+      </w:pPr>
+    </w:p>
+    <w:p>
+      <w:pPr>
+        <w:pStyle w:val="Heading2"/>
+      </w:pPr>
+      <w:r>
+        <w:t>2.8 Forzar el número de secuencia</w:t>
+      </w:r>
+    </w:p>
+    <w:tbl>
+      <w:tblPr>
+        <w:tblW w:type="auto" w:w="0"/>
+        <w:jc w:val="center"/>
+        <w:tblLook w:firstColumn="1" w:firstRow="1" w:lastColumn="0" w:lastRow="0" w:noHBand="0" w:noVBand="1" w:val="04A0"/>
+      </w:tblPr>
+      <w:tblGrid>
+        <w:gridCol w:w="9412"/>
+      </w:tblGrid>
+      <w:tr>
+        <w:tc>
+          <w:tcPr>
+            <w:tcW w:type="dxa" w:w="9411"/>
+            <w:shd w:val="clear" w:color="auto" w:fill="EAF1FB"/>
+            <w:tcBorders>
+              <w:top w:val="nil"/>
+              <w:left w:val="single" w:sz="24" w:color="2F5D9E"/>
+              <w:bottom w:val="nil"/>
+              <w:right w:val="nil"/>
+            </w:tcBorders>
+          </w:tcPr>
+          <w:p>
+            <w:pPr>
+              <w:spacing w:after="40"/>
+            </w:pPr>
+            <w:r/>
+            <w:r>
+              <w:rPr>
+                <w:b/>
+                <w:color w:val="2F5D9E"/>
+                <w:sz w:val="18"/>
+              </w:rPr>
+              <w:t>EJERCICIO</w:t>
+            </w:r>
+          </w:p>
+          <w:p>
+            <w:pPr>
+              <w:spacing w:after="40"/>
+            </w:pPr>
+            <w:r>
+              <w:rPr>
+                <w:sz w:val="20"/>
+              </w:rPr>
+              <w:t>1. Reiniciar. Iniciar a 1× y pausar cuando la segunda trama (F1) esté en el canal, pasados los 30 ms.</w:t>
+            </w:r>
+          </w:p>
+          <w:p>
+            <w:pPr>
+              <w:spacing w:after="40"/>
+            </w:pPr>
+            <w:r>
+              <w:rPr>
+                <w:sz w:val="20"/>
+              </w:rPr>
+              <w:t>2. Pulsar Forzar seq 0. Continuar.</w:t>
+            </w:r>
+          </w:p>
+        </w:tc>
+      </w:tr>
+    </w:tbl>
+    <w:p>
+      <w:pPr>
+        <w:spacing w:after="40"/>
+      </w:pPr>
+    </w:p>
+    <w:p>
+      <w:pPr>
+        <w:keepNext/>
+        <w:spacing w:after="40"/>
+        <w:jc w:val="center"/>
+      </w:pPr>
+      <w:r>
+        <w:drawing>
+          <wp:inline xmlns:a="http://schemas.openxmlformats.org/drawingml/2006/main" xmlns:pic="http://schemas.openxmlformats.org/drawingml/2006/picture">
+            <wp:extent cx="5976000" cy="4139315"/>
+            <wp:docPr id="33" name="Picture 33"/>
+            <wp:cNvGraphicFramePr>
+              <a:graphicFrameLocks noChangeAspect="1"/>
+            </wp:cNvGraphicFramePr>
+            <a:graphic>
+              <a:graphicData uri="http://schemas.openxmlformats.org/drawingml/2006/picture">
+                <pic:pic>
+                  <pic:nvPicPr>
+                    <pic:cNvPr id="0" name="s30-diagram-duplicada-inicio.png"/>
+                    <pic:cNvPicPr/>
+                  </pic:nvPicPr>
+                  <pic:blipFill>
+                    <a:blip r:embed="rId40"/>
+                    <a:stretch>
+                      <a:fillRect/>
+                    </a:stretch>
+                  </pic:blipFill>
+                  <pic:spPr>
+                    <a:xfrm>
+                      <a:off x="0" y="0"/>
+                      <a:ext cx="5976000" cy="4139315"/>
+                    </a:xfrm>
+                    <a:prstGeom prst="rect"/>
+                  </pic:spPr>
+                </pic:pic>
+              </a:graphicData>
+            </a:graphic>
+          </wp:inline>
+        </w:drawing>
+      </w:r>
+    </w:p>
+    <w:p>
+      <w:pPr>
+        <w:spacing w:after="200"/>
+        <w:jc w:val="center"/>
+      </w:pPr>
+      <w:r>
+        <w:rPr>
+          <w:b/>
+          <w:color w:val="5A5A5A"/>
+          <w:sz w:val="19"/>
+        </w:rPr>
+        <w:t xml:space="preserve">Figura 33. </w:t>
       </w:r>
       <w:r>
         <w:rPr>
@@ -13352,7 +13543,7 @@
         <w:drawing>
           <wp:inline xmlns:a="http://schemas.openxmlformats.org/drawingml/2006/main" xmlns:pic="http://schemas.openxmlformats.org/drawingml/2006/picture">
             <wp:extent cx="3420000" cy="4010357"/>
-            <wp:docPr id="33" name="Picture 33"/>
+            <wp:docPr id="34" name="Picture 34"/>
             <wp:cNvGraphicFramePr>
               <a:graphicFrameLocks noChangeAspect="1"/>
             </wp:cNvGraphicFramePr>
@@ -13364,7 +13555,7 @@
                     <pic:cNvPicPr/>
                   </pic:nvPicPr>
                   <pic:blipFill>
-                    <a:blip r:embed="rId40"/>
+                    <a:blip r:embed="rId41"/>
                     <a:stretch>
                       <a:fillRect/>
                     </a:stretch>
@@ -13394,7 +13585,7 @@
           <w:color w:val="5A5A5A"/>
           <w:sz w:val="19"/>
         </w:rPr>
-        <w:t xml:space="preserve">Figura 33. </w:t>
+        <w:t xml:space="preserve">Figura 34. </w:t>
       </w:r>
       <w:r>
         <w:rPr>
@@ -13414,7 +13605,7 @@
         <w:drawing>
           <wp:inline xmlns:a="http://schemas.openxmlformats.org/drawingml/2006/main" xmlns:pic="http://schemas.openxmlformats.org/drawingml/2006/picture">
             <wp:extent cx="5976000" cy="4139315"/>
-            <wp:docPr id="34" name="Picture 34"/>
+            <wp:docPr id="35" name="Picture 35"/>
             <wp:cNvGraphicFramePr>
               <a:graphicFrameLocks noChangeAspect="1"/>
             </wp:cNvGraphicFramePr>
@@ -13426,7 +13617,7 @@
                     <pic:cNvPicPr/>
                   </pic:nvPicPr>
                   <pic:blipFill>
-                    <a:blip r:embed="rId41"/>
+                    <a:blip r:embed="rId42"/>
                     <a:stretch>
                       <a:fillRect/>
                     </a:stretch>
@@ -13456,7 +13647,7 @@
           <w:color w:val="5A5A5A"/>
           <w:sz w:val="19"/>
         </w:rPr>
-        <w:t xml:space="preserve">Figura 34. </w:t>
+        <w:t xml:space="preserve">Figura 35. </w:t>
       </w:r>
       <w:r>
         <w:rPr>
@@ -13649,7 +13840,7 @@
         <w:drawing>
           <wp:inline xmlns:a="http://schemas.openxmlformats.org/drawingml/2006/main" xmlns:pic="http://schemas.openxmlformats.org/drawingml/2006/picture">
             <wp:extent cx="5976000" cy="4139315"/>
-            <wp:docPr id="35" name="Picture 35"/>
+            <wp:docPr id="36" name="Picture 36"/>
             <wp:cNvGraphicFramePr>
               <a:graphicFrameLocks noChangeAspect="1"/>
             </wp:cNvGraphicFramePr>
@@ -13661,7 +13852,7 @@
                     <pic:cNvPicPr/>
                   </pic:nvPicPr>
                   <pic:blipFill>
-                    <a:blip r:embed="rId42"/>
+                    <a:blip r:embed="rId43"/>
                     <a:stretch>
                       <a:fillRect/>
                     </a:stretch>
@@ -13691,7 +13882,7 @@
           <w:color w:val="5A5A5A"/>
           <w:sz w:val="19"/>
         </w:rPr>
-        <w:t xml:space="preserve">Figura 35. </w:t>
+        <w:t xml:space="preserve">Figura 36. </w:t>
       </w:r>
       <w:r>
         <w:rPr>
@@ -13837,7 +14028,7 @@
         <w:drawing>
           <wp:inline xmlns:a="http://schemas.openxmlformats.org/drawingml/2006/main" xmlns:pic="http://schemas.openxmlformats.org/drawingml/2006/picture">
             <wp:extent cx="5976000" cy="4139315"/>
-            <wp:docPr id="36" name="Picture 36"/>
+            <wp:docPr id="37" name="Picture 37"/>
             <wp:cNvGraphicFramePr>
               <a:graphicFrameLocks noChangeAspect="1"/>
             </wp:cNvGraphicFramePr>
@@ -13849,7 +14040,7 @@
                     <pic:cNvPicPr/>
                   </pic:nvPicPr>
                   <pic:blipFill>
-                    <a:blip r:embed="rId43"/>
+                    <a:blip r:embed="rId44"/>
                     <a:stretch>
                       <a:fillRect/>
                     </a:stretch>
@@ -13879,7 +14070,7 @@
           <w:color w:val="5A5A5A"/>
           <w:sz w:val="19"/>
         </w:rPr>
-        <w:t xml:space="preserve">Figura 36. </w:t>
+        <w:t xml:space="preserve">Figura 37. </w:t>
       </w:r>
       <w:r>
         <w:rPr>
@@ -14066,7 +14257,7 @@
         <w:drawing>
           <wp:inline xmlns:a="http://schemas.openxmlformats.org/drawingml/2006/main" xmlns:pic="http://schemas.openxmlformats.org/drawingml/2006/picture">
             <wp:extent cx="5976000" cy="4139315"/>
-            <wp:docPr id="37" name="Picture 37"/>
+            <wp:docPr id="38" name="Picture 38"/>
             <wp:cNvGraphicFramePr>
               <a:graphicFrameLocks noChangeAspect="1"/>
             </wp:cNvGraphicFramePr>
@@ -14078,7 +14269,7 @@
                     <pic:cNvPicPr/>
                   </pic:nvPicPr>
                   <pic:blipFill>
-                    <a:blip r:embed="rId44"/>
+                    <a:blip r:embed="rId45"/>
                     <a:stretch>
                       <a:fillRect/>
                     </a:stretch>
@@ -14108,7 +14299,7 @@
           <w:color w:val="5A5A5A"/>
           <w:sz w:val="19"/>
         </w:rPr>
-        <w:t xml:space="preserve">Figura 37. </w:t>
+        <w:t xml:space="preserve">Figura 38. </w:t>
       </w:r>
       <w:r>
         <w:rPr>
@@ -14334,7 +14525,7 @@
         <w:drawing>
           <wp:inline xmlns:a="http://schemas.openxmlformats.org/drawingml/2006/main" xmlns:pic="http://schemas.openxmlformats.org/drawingml/2006/picture">
             <wp:extent cx="5976000" cy="1437266"/>
-            <wp:docPr id="38" name="Picture 38"/>
+            <wp:docPr id="39" name="Picture 39"/>
             <wp:cNvGraphicFramePr>
               <a:graphicFrameLocks noChangeAspect="1"/>
             </wp:cNvGraphicFramePr>
@@ -14376,7 +14567,7 @@
           <w:color w:val="5A5A5A"/>
           <w:sz w:val="19"/>
         </w:rPr>
-        <w:t xml:space="preserve">Figura 38. </w:t>
+        <w:t xml:space="preserve">Figura 39. </w:t>
       </w:r>
       <w:r>
         <w:rPr>
@@ -15100,7 +15291,7 @@
         <w:drawing>
           <wp:inline xmlns:a="http://schemas.openxmlformats.org/drawingml/2006/main" xmlns:pic="http://schemas.openxmlformats.org/drawingml/2006/picture">
             <wp:extent cx="3031504" cy="8100000"/>
-            <wp:docPr id="39" name="Picture 39"/>
+            <wp:docPr id="40" name="Picture 40"/>
             <wp:cNvGraphicFramePr>
               <a:graphicFrameLocks noChangeAspect="1"/>
             </wp:cNvGraphicFramePr>
@@ -15142,7 +15333,7 @@
           <w:color w:val="5A5A5A"/>
           <w:sz w:val="19"/>
         </w:rPr>
-        <w:t xml:space="preserve">Figura 39. </w:t>
+        <w:t xml:space="preserve">Figura 40. </w:t>
       </w:r>
       <w:r>
         <w:rPr>
@@ -15365,7 +15556,7 @@
         <w:drawing>
           <wp:inline xmlns:a="http://schemas.openxmlformats.org/drawingml/2006/main" xmlns:pic="http://schemas.openxmlformats.org/drawingml/2006/picture">
             <wp:extent cx="5976000" cy="1796582"/>
-            <wp:docPr id="40" name="Picture 40"/>
+            <wp:docPr id="41" name="Picture 41"/>
             <wp:cNvGraphicFramePr>
               <a:graphicFrameLocks noChangeAspect="1"/>
             </wp:cNvGraphicFramePr>
@@ -15377,7 +15568,7 @@
                     <pic:cNvPicPr/>
                   </pic:nvPicPr>
                   <pic:blipFill>
-                    <a:blip r:embed="rId45"/>
+                    <a:blip r:embed="rId46"/>
                     <a:stretch>
                       <a:fillRect/>
                     </a:stretch>
@@ -15407,7 +15598,7 @@
           <w:color w:val="5A5A5A"/>
           <w:sz w:val="19"/>
         </w:rPr>
-        <w:t xml:space="preserve">Figura 40. </w:t>
+        <w:t xml:space="preserve">Figura 41. </w:t>
       </w:r>
       <w:r>
         <w:rPr>
@@ -15462,7 +15653,7 @@
         <w:drawing>
           <wp:inline xmlns:a="http://schemas.openxmlformats.org/drawingml/2006/main" xmlns:pic="http://schemas.openxmlformats.org/drawingml/2006/picture">
             <wp:extent cx="5976000" cy="1796582"/>
-            <wp:docPr id="41" name="Picture 41"/>
+            <wp:docPr id="42" name="Picture 42"/>
             <wp:cNvGraphicFramePr>
               <a:graphicFrameLocks noChangeAspect="1"/>
             </wp:cNvGraphicFramePr>
@@ -15471,76 +15662,6 @@
                 <pic:pic>
                   <pic:nvPicPr>
                     <pic:cNvPr id="0" name="B12c-casa-resultado.png"/>
-                    <pic:cNvPicPr/>
-                  </pic:nvPicPr>
-                  <pic:blipFill>
-                    <a:blip r:embed="rId46"/>
-                    <a:stretch>
-                      <a:fillRect/>
-                    </a:stretch>
-                  </pic:blipFill>
-                  <pic:spPr>
-                    <a:xfrm>
-                      <a:off x="0" y="0"/>
-                      <a:ext cx="5976000" cy="1796582"/>
-                    </a:xfrm>
-                    <a:prstGeom prst="rect"/>
-                  </pic:spPr>
-                </pic:pic>
-              </a:graphicData>
-            </a:graphic>
-          </wp:inline>
-        </w:drawing>
-      </w:r>
-    </w:p>
-    <w:p>
-      <w:pPr>
-        <w:spacing w:after="200"/>
-        <w:jc w:val="center"/>
-      </w:pPr>
-      <w:r>
-        <w:rPr>
-          <w:b/>
-          <w:color w:val="5A5A5A"/>
-          <w:sz w:val="19"/>
-        </w:rPr>
-        <w:t xml:space="preserve">Figura 41. </w:t>
-      </w:r>
-      <w:r>
-        <w:rPr>
-          <w:color w:val="5A5A5A"/>
-          <w:sz w:val="19"/>
-        </w:rPr>
-        <w:t>Casa → satélite → casa: dos tramos de 35 786 km, a 1 Mbit/s y 500 kbit/s. U = 0,207 %.</w:t>
-      </w:r>
-    </w:p>
-    <w:p>
-      <w:r>
-        <w:rPr>
-          <w:i w:val="0"/>
-        </w:rPr>
-        <w:t>Con dos tramos la calculadora suma tramo a tramo, como el simulador, y este ejemplo añade 1 ms de procesamiento en el satélite en cada sentido: ida = (1 + 119,3) + (2 + 119,3) + 1 = 242,6 ms, vuelta = 119,3 + 119,3 + 1 = 239,6 ms, RTT = 482,1 ms. La utilización mide el enlace del emisor: 1 ms de cada 482 = 0,207 %.</w:t>
-      </w:r>
-    </w:p>
-    <w:p>
-      <w:pPr>
-        <w:keepNext/>
-        <w:spacing w:after="40"/>
-        <w:jc w:val="center"/>
-      </w:pPr>
-      <w:r>
-        <w:drawing>
-          <wp:inline xmlns:a="http://schemas.openxmlformats.org/drawingml/2006/main" xmlns:pic="http://schemas.openxmlformats.org/drawingml/2006/picture">
-            <wp:extent cx="5976000" cy="1796582"/>
-            <wp:docPr id="42" name="Picture 42"/>
-            <wp:cNvGraphicFramePr>
-              <a:graphicFrameLocks noChangeAspect="1"/>
-            </wp:cNvGraphicFramePr>
-            <a:graphic>
-              <a:graphicData uri="http://schemas.openxmlformats.org/drawingml/2006/picture">
-                <pic:pic>
-                  <pic:nvPicPr>
-                    <pic:cNvPr id="0" name="B13-half-resultado.png"/>
                     <pic:cNvPicPr/>
                   </pic:nvPicPr>
                   <pic:blipFill>
@@ -15581,6 +15702,76 @@
           <w:color w:val="5A5A5A"/>
           <w:sz w:val="19"/>
         </w:rPr>
+        <w:t>Casa → satélite → casa: dos tramos de 35 786 km, a 1 Mbit/s y 500 kbit/s. U = 0,207 %.</w:t>
+      </w:r>
+    </w:p>
+    <w:p>
+      <w:r>
+        <w:rPr>
+          <w:i w:val="0"/>
+        </w:rPr>
+        <w:t>Con dos tramos la calculadora suma tramo a tramo, como el simulador, y este ejemplo añade 1 ms de procesamiento en el satélite en cada sentido: ida = (1 + 119,3) + (2 + 119,3) + 1 = 242,6 ms, vuelta = 119,3 + 119,3 + 1 = 239,6 ms, RTT = 482,1 ms. La utilización mide el enlace del emisor: 1 ms de cada 482 = 0,207 %.</w:t>
+      </w:r>
+    </w:p>
+    <w:p>
+      <w:pPr>
+        <w:keepNext/>
+        <w:spacing w:after="40"/>
+        <w:jc w:val="center"/>
+      </w:pPr>
+      <w:r>
+        <w:drawing>
+          <wp:inline xmlns:a="http://schemas.openxmlformats.org/drawingml/2006/main" xmlns:pic="http://schemas.openxmlformats.org/drawingml/2006/picture">
+            <wp:extent cx="5976000" cy="1796582"/>
+            <wp:docPr id="43" name="Picture 43"/>
+            <wp:cNvGraphicFramePr>
+              <a:graphicFrameLocks noChangeAspect="1"/>
+            </wp:cNvGraphicFramePr>
+            <a:graphic>
+              <a:graphicData uri="http://schemas.openxmlformats.org/drawingml/2006/picture">
+                <pic:pic>
+                  <pic:nvPicPr>
+                    <pic:cNvPr id="0" name="B13-half-resultado.png"/>
+                    <pic:cNvPicPr/>
+                  </pic:nvPicPr>
+                  <pic:blipFill>
+                    <a:blip r:embed="rId48"/>
+                    <a:stretch>
+                      <a:fillRect/>
+                    </a:stretch>
+                  </pic:blipFill>
+                  <pic:spPr>
+                    <a:xfrm>
+                      <a:off x="0" y="0"/>
+                      <a:ext cx="5976000" cy="1796582"/>
+                    </a:xfrm>
+                    <a:prstGeom prst="rect"/>
+                  </pic:spPr>
+                </pic:pic>
+              </a:graphicData>
+            </a:graphic>
+          </wp:inline>
+        </w:drawing>
+      </w:r>
+    </w:p>
+    <w:p>
+      <w:pPr>
+        <w:spacing w:after="200"/>
+        <w:jc w:val="center"/>
+      </w:pPr>
+      <w:r>
+        <w:rPr>
+          <w:b/>
+          <w:color w:val="5A5A5A"/>
+          <w:sz w:val="19"/>
+        </w:rPr>
+        <w:t xml:space="preserve">Figura 43. </w:t>
+      </w:r>
+      <w:r>
+        <w:rPr>
+          <w:color w:val="5A5A5A"/>
+          <w:sz w:val="19"/>
+        </w:rPr>
         <w:t>Satélite en half duplex con 10 ms de vuelta: el ciclo pasa de 520 a 540 ms y U baja a 3,704 %.</w:t>
       </w:r>
     </w:p>
@@ -15662,6 +15853,17 @@
               <w:t>2. Cambiar a 5 ms y comparar con los 500 bits que contó el simulador en 2.11 (allí R era 100 kbit/s, aquí 50 kbit/s).</w:t>
             </w:r>
           </w:p>
+          <w:p>
+            <w:pPr>
+              <w:spacing w:after="40"/>
+            </w:pPr>
+            <w:r>
+              <w:rPr>
+                <w:sz w:val="20"/>
+              </w:rPr>
+              <w:t>3. En el bloque Transferencia, escribir 100 con la unidad en KB.</w:t>
+            </w:r>
+          </w:p>
         </w:tc>
       </w:tr>
     </w:tbl>
@@ -15680,7 +15882,7 @@
         <w:drawing>
           <wp:inline xmlns:a="http://schemas.openxmlformats.org/drawingml/2006/main" xmlns:pic="http://schemas.openxmlformats.org/drawingml/2006/picture">
             <wp:extent cx="5976000" cy="2754759"/>
-            <wp:docPr id="43" name="Picture 43"/>
+            <wp:docPr id="44" name="Picture 44"/>
             <wp:cNvGraphicFramePr>
               <a:graphicFrameLocks noChangeAspect="1"/>
             </wp:cNvGraphicFramePr>
@@ -15722,7 +15924,7 @@
           <w:color w:val="5A5A5A"/>
           <w:sz w:val="19"/>
         </w:rPr>
-        <w:t xml:space="preserve">Figura 43. </w:t>
+        <w:t xml:space="preserve">Figura 44. </w:t>
       </w:r>
       <w:r>
         <w:rPr>
@@ -15763,7 +15965,7 @@
         <w:drawing>
           <wp:inline xmlns:a="http://schemas.openxmlformats.org/drawingml/2006/main" xmlns:pic="http://schemas.openxmlformats.org/drawingml/2006/picture">
             <wp:extent cx="5976000" cy="4267671"/>
-            <wp:docPr id="44" name="Picture 44"/>
+            <wp:docPr id="45" name="Picture 45"/>
             <wp:cNvGraphicFramePr>
               <a:graphicFrameLocks noChangeAspect="1"/>
             </wp:cNvGraphicFramePr>
@@ -15775,7 +15977,7 @@
                     <pic:cNvPicPr/>
                   </pic:nvPicPr>
                   <pic:blipFill>
-                    <a:blip r:embed="rId31"/>
+                    <a:blip r:embed="rId32"/>
                     <a:stretch>
                       <a:fillRect/>
                     </a:stretch>
@@ -15805,7 +16007,7 @@
           <w:color w:val="5A5A5A"/>
           <w:sz w:val="19"/>
         </w:rPr>
-        <w:t xml:space="preserve">Figura 44. </w:t>
+        <w:t xml:space="preserve">Figura 45. </w:t>
       </w:r>
       <w:r>
         <w:rPr>
@@ -15833,7 +16035,7 @@
         <w:rPr>
           <w:i w:val="0"/>
         </w:rPr>
-        <w:t>El caudal conseguido coincide con el caudal útil del Resultado: es la misma magnitud vista desde el fichero completo en lugar de desde una sola trama. Ver en la Parte 1 la nota sobre este bloque: en la versión actual el campo de tamaño no está accesible desde la interfaz.</w:t>
+        <w:t>El caudal conseguido coincide con el caudal útil del Resultado: es la misma magnitud vista desde el fichero completo en lugar de desde una sola trama.</w:t>
       </w:r>
     </w:p>
     <w:sectPr>

</xml_diff>